<commit_message>
Add Online Quiz mini project and update mini project report docx
Agent-Logs-Url: https://github.com/bsovhalkar/WT/sessions/fce757c0-b4b8-4f5d-9c7f-81beb4f51081

Co-authored-by: bsovhalkar <176640367+bsovhalkar@users.noreply.github.com>
</commit_message>
<xml_diff>
--- a/Mini_Project Report   for web technology.docx
+++ b/Mini_Project Report   for web technology.docx
@@ -1,6 +1,6 @@
 
 <file path=word/document.xml><?xml version="1.0" encoding="utf-8"?>
-<w:document xmlns:w="http://schemas.openxmlformats.org/wordprocessingml/2006/main">
+<w:document xmlns:ns1="urn:schemas-microsoft-com:vml" xmlns:ns2="urn:schemas-microsoft-com:office:office" xmlns:ns3="http://schemas.openxmlformats.org/officeDocument/2006/relationships" xmlns:w="http://schemas.openxmlformats.org/wordprocessingml/2006/main">
   <w:body>
     <w:p>
       <w:pPr>
@@ -50,11 +50,11 @@
       </w:pPr>
       <w:r>
         <w:object w:dxaOrig="9129" w:dyaOrig="1251">
-          <v:rect xmlns:o="urn:schemas-microsoft-com:office:office" xmlns:v="urn:schemas-microsoft-com:vml" id="rectole0000000000" style="width:456.450000pt;height:62.550000pt" o:preferrelative="t" o:ole="">
-            <o:lock v:ext="edit"/>
-            <v:imagedata xmlns:r="http://schemas.openxmlformats.org/officeDocument/2006/relationships" r:id="docRId1" o:title=""/>
-          </v:rect>
-          <o:OLEObject xmlns:r="http://schemas.openxmlformats.org/officeDocument/2006/relationships" xmlns:o="urn:schemas-microsoft-com:office:office" Type="Embed" ProgID="StaticMetafile" DrawAspect="Content" ObjectID="0000000000" ShapeID="rectole0000000000" r:id="docRId0"/>
+          <ns1:rect id="rectole0000000000" style="width:456.450000pt;height:62.550000pt" ns2:preferrelative="t" ns2:ole="">
+            <ns2:lock ns1:ext="edit"/>
+            <ns1:imagedata ns3:id="docRId1" ns2:title=""/>
+          </ns1:rect>
+          <ns2:OLEObject Type="Embed" ProgID="StaticMetafile" DrawAspect="Content" ObjectID="0000000000" ShapeID="rectole0000000000" ns3:id="docRId0"/>
         </w:object>
       </w:r>
     </w:p>
@@ -167,7 +167,7 @@
           <w:sz w:val="28"/>
           <w:shd w:fill="auto" w:val="clear"/>
         </w:rPr>
-        <w:t xml:space="preserve">“Title of the Project</w:t>
+        <w:t xml:space="preserve">“Online Quiz System</w:t>
       </w:r>
       <w:r>
         <w:rPr>
@@ -807,7 +807,7 @@
           <w:u w:val="single"/>
           <w:shd w:fill="auto" w:val="clear"/>
         </w:rPr>
-        <w:t xml:space="preserve">1.Abstract:</w:t>
+        <w:t xml:space="preserve">1.Abstract: The Online Quiz System is a simple web-based application that presents multiple-choice questions, accepts user responses, calculates the score automatically, and shows an instant result summary.</w:t>
       </w:r>
     </w:p>
     <w:p>
@@ -862,7 +862,7 @@
           <w:u w:val="single"/>
           <w:shd w:fill="auto" w:val="clear"/>
         </w:rPr>
-        <w:t xml:space="preserve">Introduction of your project :</w:t>
+        <w:t xml:space="preserve">Introduction of your project : This project helps users attempt a short MCQ quiz in a browser and get immediate performance feedback. It demonstrates core front-end web technologies and basic user interaction design.</w:t>
       </w:r>
     </w:p>
     <w:p>
@@ -918,91 +918,91 @@
           <w:u w:val="single"/>
           <w:shd w:fill="auto" w:val="clear"/>
         </w:rPr>
-        <w:t xml:space="preserve">why you choose this model .</w:t>
-      </w:r>
-    </w:p>
-    <w:p>
-      <w:pPr>
-        <w:spacing w:before="147" w:after="0" w:line="240"/>
-        <w:ind w:right="0" w:left="140" w:firstLine="140"/>
-        <w:jc w:val="left"/>
-        <w:rPr>
-          <w:rFonts w:ascii="Times New Roman" w:hAnsi="Times New Roman" w:cs="Times New Roman" w:eastAsia="Times New Roman"/>
-          <w:color w:val="auto"/>
-          <w:spacing w:val="0"/>
-          <w:position w:val="0"/>
-          <w:sz w:val="36"/>
-          <w:u w:val="single"/>
-          <w:shd w:fill="auto" w:val="clear"/>
-        </w:rPr>
-      </w:pPr>
-      <w:r>
-        <w:rPr>
-          <w:rFonts w:ascii="Times New Roman" w:hAnsi="Times New Roman" w:cs="Times New Roman" w:eastAsia="Times New Roman"/>
-          <w:color w:val="auto"/>
-          <w:spacing w:val="0"/>
-          <w:position w:val="0"/>
-          <w:sz w:val="36"/>
-          <w:u w:val="single"/>
-          <w:shd w:fill="auto" w:val="clear"/>
-        </w:rPr>
-        <w:t xml:space="preserve"> Write Steps acc to model</w:t>
-      </w:r>
-    </w:p>
-    <w:p>
-      <w:pPr>
-        <w:spacing w:before="147" w:after="0" w:line="240"/>
-        <w:ind w:right="0" w:left="140" w:firstLine="140"/>
-        <w:jc w:val="left"/>
-        <w:rPr>
-          <w:rFonts w:ascii="Times New Roman" w:hAnsi="Times New Roman" w:cs="Times New Roman" w:eastAsia="Times New Roman"/>
-          <w:b/>
-          <w:color w:val="auto"/>
-          <w:spacing w:val="0"/>
-          <w:position w:val="0"/>
-          <w:sz w:val="36"/>
-          <w:u w:val="single"/>
-          <w:shd w:fill="auto" w:val="clear"/>
-        </w:rPr>
-      </w:pPr>
-      <w:r>
-        <w:rPr>
-          <w:rFonts w:ascii="Times New Roman" w:hAnsi="Times New Roman" w:cs="Times New Roman" w:eastAsia="Times New Roman"/>
-          <w:b/>
-          <w:color w:val="auto"/>
-          <w:spacing w:val="0"/>
-          <w:position w:val="0"/>
-          <w:sz w:val="36"/>
-          <w:u w:val="single"/>
-          <w:shd w:fill="auto" w:val="clear"/>
-        </w:rPr>
-        <w:t xml:space="preserve">3.Requirement Analysis(write 2 /3lines)/Objectives</w:t>
-      </w:r>
-    </w:p>
-    <w:p>
-      <w:pPr>
-        <w:spacing w:before="147" w:after="0" w:line="240"/>
-        <w:ind w:right="0" w:left="140" w:firstLine="140"/>
-        <w:jc w:val="left"/>
-        <w:rPr>
-          <w:rFonts w:ascii="Times New Roman" w:hAnsi="Times New Roman" w:cs="Times New Roman" w:eastAsia="Times New Roman"/>
-          <w:color w:val="auto"/>
-          <w:spacing w:val="0"/>
-          <w:position w:val="0"/>
-          <w:sz w:val="36"/>
-          <w:shd w:fill="auto" w:val="clear"/>
-        </w:rPr>
-      </w:pPr>
-      <w:r>
-        <w:rPr>
-          <w:rFonts w:ascii="Times New Roman" w:hAnsi="Times New Roman" w:cs="Times New Roman" w:eastAsia="Times New Roman"/>
-          <w:color w:val="auto"/>
-          <w:spacing w:val="0"/>
-          <w:position w:val="0"/>
-          <w:sz w:val="36"/>
-          <w:shd w:fill="auto" w:val="clear"/>
-        </w:rPr>
-        <w:t xml:space="preserve">The main objectives of the Portfolio Website project</w:t>
+        <w:t xml:space="preserve">Why this model: Requirements are straightforward, and each stage can be completed sequentially with easy documentation.</w:t>
+      </w:r>
+    </w:p>
+    <w:p>
+      <w:pPr>
+        <w:spacing w:before="147" w:after="0" w:line="240"/>
+        <w:ind w:right="0" w:left="140" w:firstLine="140"/>
+        <w:jc w:val="left"/>
+        <w:rPr>
+          <w:rFonts w:ascii="Times New Roman" w:hAnsi="Times New Roman" w:cs="Times New Roman" w:eastAsia="Times New Roman"/>
+          <w:color w:val="auto"/>
+          <w:spacing w:val="0"/>
+          <w:position w:val="0"/>
+          <w:sz w:val="36"/>
+          <w:u w:val="single"/>
+          <w:shd w:fill="auto" w:val="clear"/>
+        </w:rPr>
+      </w:pPr>
+      <w:r>
+        <w:rPr>
+          <w:rFonts w:ascii="Times New Roman" w:hAnsi="Times New Roman" w:cs="Times New Roman" w:eastAsia="Times New Roman"/>
+          <w:color w:val="auto"/>
+          <w:spacing w:val="0"/>
+          <w:position w:val="0"/>
+          <w:sz w:val="36"/>
+          <w:u w:val="single"/>
+          <w:shd w:fill="auto" w:val="clear"/>
+        </w:rPr>
+        <w:t xml:space="preserve">Steps according to model: Requirement analysis -&gt; Design -&gt; Implementation -&gt; Testing -&gt; Deployment.</w:t>
+      </w:r>
+    </w:p>
+    <w:p>
+      <w:pPr>
+        <w:spacing w:before="147" w:after="0" w:line="240"/>
+        <w:ind w:right="0" w:left="140" w:firstLine="140"/>
+        <w:jc w:val="left"/>
+        <w:rPr>
+          <w:rFonts w:ascii="Times New Roman" w:hAnsi="Times New Roman" w:cs="Times New Roman" w:eastAsia="Times New Roman"/>
+          <w:b/>
+          <w:color w:val="auto"/>
+          <w:spacing w:val="0"/>
+          <w:position w:val="0"/>
+          <w:sz w:val="36"/>
+          <w:u w:val="single"/>
+          <w:shd w:fill="auto" w:val="clear"/>
+        </w:rPr>
+      </w:pPr>
+      <w:r>
+        <w:rPr>
+          <w:rFonts w:ascii="Times New Roman" w:hAnsi="Times New Roman" w:cs="Times New Roman" w:eastAsia="Times New Roman"/>
+          <w:b/>
+          <w:color w:val="auto"/>
+          <w:spacing w:val="0"/>
+          <w:position w:val="0"/>
+          <w:sz w:val="36"/>
+          <w:u w:val="single"/>
+          <w:shd w:fill="auto" w:val="clear"/>
+        </w:rPr>
+        <w:t xml:space="preserve">3.Requirement Analysis/Objectives: The system should display MCQ questions, allow single-option selection, compute score accurately, and show final result with percentage. The interface should be simple, responsive, and easy to use for students.</w:t>
+      </w:r>
+    </w:p>
+    <w:p>
+      <w:pPr>
+        <w:spacing w:before="147" w:after="0" w:line="240"/>
+        <w:ind w:right="0" w:left="140" w:firstLine="140"/>
+        <w:jc w:val="left"/>
+        <w:rPr>
+          <w:rFonts w:ascii="Times New Roman" w:hAnsi="Times New Roman" w:cs="Times New Roman" w:eastAsia="Times New Roman"/>
+          <w:color w:val="auto"/>
+          <w:spacing w:val="0"/>
+          <w:position w:val="0"/>
+          <w:sz w:val="36"/>
+          <w:shd w:fill="auto" w:val="clear"/>
+        </w:rPr>
+      </w:pPr>
+      <w:r>
+        <w:rPr>
+          <w:rFonts w:ascii="Times New Roman" w:hAnsi="Times New Roman" w:cs="Times New Roman" w:eastAsia="Times New Roman"/>
+          <w:color w:val="auto"/>
+          <w:spacing w:val="0"/>
+          <w:position w:val="0"/>
+          <w:sz w:val="36"/>
+          <w:shd w:fill="auto" w:val="clear"/>
+        </w:rPr>
+        <w:t xml:space="preserve">Main objectives: Build an interactive quiz interface, perform client-side validation, and present quick result analysis to users.</w:t>
       </w:r>
     </w:p>
     <w:p>
@@ -1088,7 +1088,7 @@
           <w:u w:val="single"/>
           <w:shd w:fill="auto" w:val="clear"/>
         </w:rPr>
-        <w:t xml:space="preserve">Design Tools: Figma / Canva (for wireframe and layout design)</w:t>
+        <w:t xml:space="preserve">Design Approach: Basic wireframe and structured layout for question cards and result section.</w:t>
       </w:r>
     </w:p>
     <w:p>
@@ -1144,64 +1144,64 @@
           <w:u w:val="single"/>
           <w:shd w:fill="auto" w:val="clear"/>
         </w:rPr>
-        <w:t xml:space="preserve">Browser: Google Chrome / Mozilla Firefox</w:t>
-      </w:r>
-    </w:p>
-    <w:p>
-      <w:pPr>
-        <w:spacing w:before="147" w:after="0" w:line="240"/>
-        <w:ind w:right="0" w:left="140" w:firstLine="140"/>
-        <w:jc w:val="left"/>
-        <w:rPr>
-          <w:rFonts w:ascii="Times New Roman" w:hAnsi="Times New Roman" w:cs="Times New Roman" w:eastAsia="Times New Roman"/>
-          <w:color w:val="auto"/>
-          <w:spacing w:val="0"/>
-          <w:position w:val="0"/>
-          <w:sz w:val="36"/>
-          <w:u w:val="single"/>
-          <w:shd w:fill="auto" w:val="clear"/>
-        </w:rPr>
-      </w:pPr>
-      <w:r>
-        <w:rPr>
-          <w:rFonts w:ascii="Times New Roman" w:hAnsi="Times New Roman" w:cs="Times New Roman" w:eastAsia="Times New Roman"/>
-          <w:color w:val="auto"/>
-          <w:spacing w:val="0"/>
-          <w:position w:val="0"/>
-          <w:sz w:val="36"/>
-          <w:u w:val="single"/>
-          <w:shd w:fill="auto" w:val="clear"/>
-        </w:rPr>
-        <w:t xml:space="preserve">Hosting Platform (optional): GitHub Pages / Netlify</w:t>
-      </w:r>
-    </w:p>
-    <w:p>
-      <w:pPr>
-        <w:spacing w:before="147" w:after="0" w:line="240"/>
-        <w:ind w:right="0" w:left="140" w:firstLine="140"/>
-        <w:jc w:val="left"/>
-        <w:rPr>
-          <w:rFonts w:ascii="Times New Roman" w:hAnsi="Times New Roman" w:cs="Times New Roman" w:eastAsia="Times New Roman"/>
-          <w:color w:val="auto"/>
-          <w:spacing w:val="0"/>
-          <w:position w:val="0"/>
-          <w:sz w:val="36"/>
-          <w:u w:val="single"/>
-          <w:shd w:fill="auto" w:val="clear"/>
-        </w:rPr>
-      </w:pPr>
-      <w:r>
-        <w:rPr>
-          <w:rFonts w:ascii="Times New Roman" w:hAnsi="Times New Roman" w:cs="Times New Roman" w:eastAsia="Times New Roman"/>
-          <w:b/>
-          <w:color w:val="auto"/>
-          <w:spacing w:val="0"/>
-          <w:position w:val="0"/>
-          <w:sz w:val="36"/>
-          <w:u w:val="single"/>
-          <w:shd w:fill="auto" w:val="clear"/>
-        </w:rPr>
-        <w:t xml:space="preserve">5.System Design</w:t>
+        <w:t xml:space="preserve">Browsers Tested: Google Chrome, Mozilla Firefox, Microsoft Edge</w:t>
+      </w:r>
+    </w:p>
+    <w:p>
+      <w:pPr>
+        <w:spacing w:before="147" w:after="0" w:line="240"/>
+        <w:ind w:right="0" w:left="140" w:firstLine="140"/>
+        <w:jc w:val="left"/>
+        <w:rPr>
+          <w:rFonts w:ascii="Times New Roman" w:hAnsi="Times New Roman" w:cs="Times New Roman" w:eastAsia="Times New Roman"/>
+          <w:color w:val="auto"/>
+          <w:spacing w:val="0"/>
+          <w:position w:val="0"/>
+          <w:sz w:val="36"/>
+          <w:u w:val="single"/>
+          <w:shd w:fill="auto" w:val="clear"/>
+        </w:rPr>
+      </w:pPr>
+      <w:r>
+        <w:rPr>
+          <w:rFonts w:ascii="Times New Roman" w:hAnsi="Times New Roman" w:cs="Times New Roman" w:eastAsia="Times New Roman"/>
+          <w:color w:val="auto"/>
+          <w:spacing w:val="0"/>
+          <w:position w:val="0"/>
+          <w:sz w:val="36"/>
+          <w:u w:val="single"/>
+          <w:shd w:fill="auto" w:val="clear"/>
+        </w:rPr>
+        <w:t xml:space="preserve">Hosting Platform (optional): GitHub Pages</w:t>
+      </w:r>
+    </w:p>
+    <w:p>
+      <w:pPr>
+        <w:spacing w:before="147" w:after="0" w:line="240"/>
+        <w:ind w:right="0" w:left="140" w:firstLine="140"/>
+        <w:jc w:val="left"/>
+        <w:rPr>
+          <w:rFonts w:ascii="Times New Roman" w:hAnsi="Times New Roman" w:cs="Times New Roman" w:eastAsia="Times New Roman"/>
+          <w:color w:val="auto"/>
+          <w:spacing w:val="0"/>
+          <w:position w:val="0"/>
+          <w:sz w:val="36"/>
+          <w:u w:val="single"/>
+          <w:shd w:fill="auto" w:val="clear"/>
+        </w:rPr>
+      </w:pPr>
+      <w:r>
+        <w:rPr>
+          <w:rFonts w:ascii="Times New Roman" w:hAnsi="Times New Roman" w:cs="Times New Roman" w:eastAsia="Times New Roman"/>
+          <w:b/>
+          <w:color w:val="auto"/>
+          <w:spacing w:val="0"/>
+          <w:position w:val="0"/>
+          <w:sz w:val="36"/>
+          <w:u w:val="single"/>
+          <w:shd w:fill="auto" w:val="clear"/>
+        </w:rPr>
+        <w:t xml:space="preserve">5.System Design: The system includes a quiz form module (questions/options), answer-key logic, score calculator, and result display module.</w:t>
       </w:r>
     </w:p>
     <w:p>
@@ -1221,11 +1221,11 @@
       </w:pPr>
       <w:r>
         <w:object w:dxaOrig="8640" w:dyaOrig="8010">
-          <v:rect xmlns:o="urn:schemas-microsoft-com:office:office" xmlns:v="urn:schemas-microsoft-com:vml" id="rectole0000000001" style="width:432.000000pt;height:400.500000pt" o:preferrelative="t" o:ole="">
-            <o:lock v:ext="edit"/>
-            <v:imagedata xmlns:r="http://schemas.openxmlformats.org/officeDocument/2006/relationships" r:id="docRId3" o:title=""/>
-          </v:rect>
-          <o:OLEObject xmlns:r="http://schemas.openxmlformats.org/officeDocument/2006/relationships" xmlns:o="urn:schemas-microsoft-com:office:office" Type="Embed" ProgID="StaticMetafile" DrawAspect="Content" ObjectID="0000000001" ShapeID="rectole0000000001" r:id="docRId2"/>
+          <ns1:rect id="rectole0000000001" style="width:432.000000pt;height:400.500000pt" ns2:preferrelative="t" ns2:ole="">
+            <ns2:lock ns1:ext="edit"/>
+            <ns1:imagedata ns3:id="docRId3" ns2:title=""/>
+          </ns1:rect>
+          <ns2:OLEObject Type="Embed" ProgID="StaticMetafile" DrawAspect="Content" ObjectID="0000000001" ShapeID="rectole0000000001" ns3:id="docRId2"/>
         </w:object>
       </w:r>
     </w:p>
@@ -1270,35 +1270,35 @@
           <w:u w:val="single"/>
           <w:shd w:fill="auto" w:val="clear"/>
         </w:rPr>
-        <w:t xml:space="preserve">5.Implementation </w:t>
-      </w:r>
-    </w:p>
-    <w:p>
-      <w:pPr>
-        <w:spacing w:before="147" w:after="0" w:line="240"/>
-        <w:ind w:right="0" w:left="140" w:firstLine="140"/>
-        <w:jc w:val="left"/>
-        <w:rPr>
-          <w:rFonts w:ascii="Times New Roman" w:hAnsi="Times New Roman" w:cs="Times New Roman" w:eastAsia="Times New Roman"/>
-          <w:color w:val="auto"/>
-          <w:spacing w:val="0"/>
-          <w:position w:val="0"/>
-          <w:sz w:val="36"/>
-          <w:u w:val="single"/>
-          <w:shd w:fill="auto" w:val="clear"/>
-        </w:rPr>
-      </w:pPr>
-      <w:r>
-        <w:rPr>
-          <w:rFonts w:ascii="Times New Roman" w:hAnsi="Times New Roman" w:cs="Times New Roman" w:eastAsia="Times New Roman"/>
-          <w:color w:val="auto"/>
-          <w:spacing w:val="0"/>
-          <w:position w:val="0"/>
-          <w:sz w:val="36"/>
-          <w:u w:val="single"/>
-          <w:shd w:fill="auto" w:val="clear"/>
-        </w:rPr>
-        <w:t xml:space="preserve">6.Testing </w:t>
+        <w:t xml:space="preserve">5.Implementation: Implemented using HTML for structure, CSS for styling, and JavaScript for answer validation, score calculation, percentage generation, and reset functionality.</w:t>
+      </w:r>
+    </w:p>
+    <w:p>
+      <w:pPr>
+        <w:spacing w:before="147" w:after="0" w:line="240"/>
+        <w:ind w:right="0" w:left="140" w:firstLine="140"/>
+        <w:jc w:val="left"/>
+        <w:rPr>
+          <w:rFonts w:ascii="Times New Roman" w:hAnsi="Times New Roman" w:cs="Times New Roman" w:eastAsia="Times New Roman"/>
+          <w:color w:val="auto"/>
+          <w:spacing w:val="0"/>
+          <w:position w:val="0"/>
+          <w:sz w:val="36"/>
+          <w:u w:val="single"/>
+          <w:shd w:fill="auto" w:val="clear"/>
+        </w:rPr>
+      </w:pPr>
+      <w:r>
+        <w:rPr>
+          <w:rFonts w:ascii="Times New Roman" w:hAnsi="Times New Roman" w:cs="Times New Roman" w:eastAsia="Times New Roman"/>
+          <w:color w:val="auto"/>
+          <w:spacing w:val="0"/>
+          <w:position w:val="0"/>
+          <w:sz w:val="36"/>
+          <w:u w:val="single"/>
+          <w:shd w:fill="auto" w:val="clear"/>
+        </w:rPr>
+        <w:t xml:space="preserve">6.Testing: Tested with full-correct, partial-correct, and no-selection cases to verify score and percentage. UI behavior was checked on common desktop browsers.</w:t>
       </w:r>
     </w:p>
     <w:p>
@@ -1352,63 +1352,63 @@
           <w:u w:val="single"/>
           <w:shd w:fill="auto" w:val="clear"/>
         </w:rPr>
-        <w:t xml:space="preserve">7.Outputs screen shot</w:t>
-      </w:r>
-    </w:p>
-    <w:p>
-      <w:pPr>
-        <w:spacing w:before="147" w:after="0" w:line="240"/>
-        <w:ind w:right="0" w:left="140" w:firstLine="140"/>
-        <w:jc w:val="left"/>
-        <w:rPr>
-          <w:rFonts w:ascii="Times New Roman" w:hAnsi="Times New Roman" w:cs="Times New Roman" w:eastAsia="Times New Roman"/>
-          <w:color w:val="auto"/>
-          <w:spacing w:val="0"/>
-          <w:position w:val="0"/>
-          <w:sz w:val="36"/>
-          <w:u w:val="single"/>
-          <w:shd w:fill="auto" w:val="clear"/>
-        </w:rPr>
-      </w:pPr>
-      <w:r>
-        <w:rPr>
-          <w:rFonts w:ascii="Times New Roman" w:hAnsi="Times New Roman" w:cs="Times New Roman" w:eastAsia="Times New Roman"/>
-          <w:color w:val="auto"/>
-          <w:spacing w:val="0"/>
-          <w:position w:val="0"/>
-          <w:sz w:val="36"/>
-          <w:u w:val="single"/>
-          <w:shd w:fill="auto" w:val="clear"/>
-        </w:rPr>
-        <w:t xml:space="preserve">8.Conclusion</w:t>
-      </w:r>
-    </w:p>
-    <w:p>
-      <w:pPr>
-        <w:spacing w:before="147" w:after="0" w:line="240"/>
-        <w:ind w:right="0" w:left="140" w:firstLine="140"/>
-        <w:jc w:val="left"/>
-        <w:rPr>
-          <w:rFonts w:ascii="Times New Roman" w:hAnsi="Times New Roman" w:cs="Times New Roman" w:eastAsia="Times New Roman"/>
-          <w:color w:val="auto"/>
-          <w:spacing w:val="0"/>
-          <w:position w:val="0"/>
-          <w:sz w:val="36"/>
-          <w:u w:val="single"/>
-          <w:shd w:fill="auto" w:val="clear"/>
-        </w:rPr>
-      </w:pPr>
-      <w:r>
-        <w:rPr>
-          <w:rFonts w:ascii="Times New Roman" w:hAnsi="Times New Roman" w:cs="Times New Roman" w:eastAsia="Times New Roman"/>
-          <w:color w:val="auto"/>
-          <w:spacing w:val="0"/>
-          <w:position w:val="0"/>
-          <w:sz w:val="36"/>
-          <w:u w:val="single"/>
-          <w:shd w:fill="auto" w:val="clear"/>
-        </w:rPr>
-        <w:t xml:space="preserve">Future Scope</w:t>
+        <w:t xml:space="preserve">7.Outputs screen shot: Include screenshots of quiz page before submission and result page after submission.</w:t>
+      </w:r>
+    </w:p>
+    <w:p>
+      <w:pPr>
+        <w:spacing w:before="147" w:after="0" w:line="240"/>
+        <w:ind w:right="0" w:left="140" w:firstLine="140"/>
+        <w:jc w:val="left"/>
+        <w:rPr>
+          <w:rFonts w:ascii="Times New Roman" w:hAnsi="Times New Roman" w:cs="Times New Roman" w:eastAsia="Times New Roman"/>
+          <w:color w:val="auto"/>
+          <w:spacing w:val="0"/>
+          <w:position w:val="0"/>
+          <w:sz w:val="36"/>
+          <w:u w:val="single"/>
+          <w:shd w:fill="auto" w:val="clear"/>
+        </w:rPr>
+      </w:pPr>
+      <w:r>
+        <w:rPr>
+          <w:rFonts w:ascii="Times New Roman" w:hAnsi="Times New Roman" w:cs="Times New Roman" w:eastAsia="Times New Roman"/>
+          <w:color w:val="auto"/>
+          <w:spacing w:val="0"/>
+          <w:position w:val="0"/>
+          <w:sz w:val="36"/>
+          <w:u w:val="single"/>
+          <w:shd w:fill="auto" w:val="clear"/>
+        </w:rPr>
+        <w:t xml:space="preserve">8.Conclusion: The Online Quiz System successfully demonstrates a simple and functional MCQ assessment platform using core web technologies.</w:t>
+      </w:r>
+    </w:p>
+    <w:p>
+      <w:pPr>
+        <w:spacing w:before="147" w:after="0" w:line="240"/>
+        <w:ind w:right="0" w:left="140" w:firstLine="140"/>
+        <w:jc w:val="left"/>
+        <w:rPr>
+          <w:rFonts w:ascii="Times New Roman" w:hAnsi="Times New Roman" w:cs="Times New Roman" w:eastAsia="Times New Roman"/>
+          <w:color w:val="auto"/>
+          <w:spacing w:val="0"/>
+          <w:position w:val="0"/>
+          <w:sz w:val="36"/>
+          <w:u w:val="single"/>
+          <w:shd w:fill="auto" w:val="clear"/>
+        </w:rPr>
+      </w:pPr>
+      <w:r>
+        <w:rPr>
+          <w:rFonts w:ascii="Times New Roman" w:hAnsi="Times New Roman" w:cs="Times New Roman" w:eastAsia="Times New Roman"/>
+          <w:color w:val="auto"/>
+          <w:spacing w:val="0"/>
+          <w:position w:val="0"/>
+          <w:sz w:val="36"/>
+          <w:u w:val="single"/>
+          <w:shd w:fill="auto" w:val="clear"/>
+        </w:rPr>
+        <w:t xml:space="preserve">Future Scope: Add question randomization, timer, admin panel for question management, database storage, and user authentication.</w:t>
       </w:r>
     </w:p>
     <w:p>
@@ -1447,7 +1447,7 @@
           <w:sz w:val="36"/>
           <w:shd w:fill="auto" w:val="clear"/>
         </w:rPr>
-        <w:t xml:space="preserve">References </w:t>
+        <w:t xml:space="preserve">References: MDN Web Docs (HTML, CSS, JavaScript), W3Schools, course notes.</w:t>
       </w:r>
     </w:p>
     <w:p>

</xml_diff>